<commit_message>
Carta aclaratoria: solo direccion del padre (CRA 8 vigente vs TV 8 antigua)
Co-Authored-By: Claude Sonnet 5.5 <noreply@anthropic.com>
Claude-Session: https://claude.ai/code/session_018P46KYpkiRHGX9ugiP1bDC
</commit_message>
<xml_diff>
--- a/entregables/Carta_aclaratoria_direccion_FORE.docx
+++ b/entregables/Carta_aclaratoria_direccion_FORE.docx
@@ -36,7 +36,7 @@
         <w:rPr>
           <w:b/>
         </w:rPr>
-        <w:t>Asunto: Aclaración de dirección de residencia del responsable socioeconómico</w:t>
+        <w:t>Asunto: Aclaración de dirección de residencia del padre de la admitida</w:t>
         <w:br/>
         <w:t>Referencia: Respuesta a la solicitud con consecutivo 379 del 19/10/2026</w:t>
         <w:br/>
@@ -63,7 +63,7 @@
         <w:rPr>
           <w:b w:val="0"/>
         </w:rPr>
-        <w:t>Yo, Rafael Ricardo Herrera Berbeo, identificado con cédula de ciudadanía No. 1.069.724.809 de Fusagasugá, padre y responsable socioeconómico de la admitida Sarah Herrera Godoy, me dirijo a ustedes para aclarar la diferencia entre la dirección registrada en el Formulario de Registro Electrónico (FORE) y la que figura en el recibo de servicios públicos domiciliarios que adjunto.</w:t>
+        <w:t>Yo, Rafael Ricardo Herrera Berbeo, identificado con cédula de ciudadanía No. 1.069.724.809 de Fusagasugá, padre de la admitida Sarah Herrera Godoy, me dirijo a ustedes para aclarar la diferencia entre la dirección registrada en el Formulario de Registro Electrónico (FORE) y la que figura en los recibos de servicios públicos domiciliarios que adjunto.</w:t>
       </w:r>
     </w:p>
     <w:p>
@@ -74,7 +74,7 @@
         <w:rPr>
           <w:b w:val="0"/>
         </w:rPr>
-        <w:t>1. Dirección registrada en el FORE: Carrera 8 # 23 - 41, Apartamento 404 B, Fusagasugá (Cundinamarca).</w:t>
+        <w:t>• Dirección registrada en el FORE (vigente): Carrera 8 # 23 - 41, Apartamento 404 B, Fusagasugá (Cundinamarca).</w:t>
       </w:r>
     </w:p>
     <w:p>
@@ -85,7 +85,7 @@
         <w:rPr>
           <w:b w:val="0"/>
         </w:rPr>
-        <w:t>2. Dirección que figura en el recibo de servicios públicos (Emserfusa, periodo de septiembre de 2026, código interno 2466940, barrio Bosques de la Cañada, estrato 4): TV 8 23 27 AP 404 B, Fusagasugá (Cundinamarca).</w:t>
+        <w:t>• Dirección que figura en los recibos de servicios públicos (nomenclatura antigua): TV 8 23 27 AP 404 B, Fusagasugá (Cundinamarca).</w:t>
       </w:r>
     </w:p>
     <w:p>
@@ -97,19 +97,7 @@
         <w:rPr>
           <w:b w:val="0"/>
         </w:rPr>
-        <w:t>Se trata del mismo inmueble, ubicado en el municipio de Fusagasugá. La diferencia obedece a una actualización de la nomenclatura urbana que aún no se ha reflejado de manera uniforme en los documentos y en las facturas de las empresas de servicios públicos. En consecuencia, la dirección de residencia no ha cambiado: es la misma vivienda, identificada con dos nomenclaturas.</w:t>
-      </w:r>
-    </w:p>
-    <w:p>
-      <w:pPr>
-        <w:spacing w:after="160"/>
-        <w:jc w:val="both"/>
-      </w:pPr>
-      <w:r>
-        <w:rPr>
-          <w:b w:val="0"/>
-        </w:rPr>
-        <w:t>El recibo adjunto figura a nombre de [NOMBRE DEL TITULAR DEL RECIBO – parentesco o calidad respecto del inmueble], y la vivienda es la residencia del suscrito y de la admitida.</w:t>
+        <w:t>Ambas direcciones corresponden al mismo inmueble, que es la residencia de la admitida Sarah Herrera Godoy. La nomenclatura “TV 8” es la antigua y continúa apareciendo en los recibos porque aún no ha sido actualizada por razones administrativas que corresponden al conjunto residencial.</w:t>
       </w:r>
     </w:p>
     <w:p>
@@ -121,7 +109,7 @@
         <w:rPr>
           <w:b w:val="0"/>
         </w:rPr>
-        <w:t>Quedo atento a cualquier documento o confirmación adicional que requieran para la verificación de la información socioeconómica, y agradezco de antemano su comprensión.</w:t>
+        <w:t>Quedo atento a cualquier documento o confirmación adicional que requieran, y agradezco de antemano su comprensión.</w:t>
       </w:r>
     </w:p>
     <w:p>
@@ -149,7 +137,7 @@
         <w:br/>
         <w:t>C.C. 1.069.724.809 de Fusagasugá</w:t>
         <w:br/>
-        <w:t>Padre y responsable socioeconómico de Sarah Herrera Godoy (T.I. 1141521194)</w:t>
+        <w:t>Padre de Sarah Herrera Godoy (T.I. 1141521194)</w:t>
         <w:br/>
         <w:t>Correo: rrhb0911@gmail.com  |  Celular: 3337092919</w:t>
       </w:r>

</xml_diff>